<commit_message>
Reconstruct original Fig9 as cluster -> early keywords -> late keywords alluvial Sankey (matplotlib, 600 DPI); update manuscript and docx
</commit_message>
<xml_diff>
--- a/manuscript/paper_HPP_new.docx
+++ b/manuscript/paper_HPP_new.docx
@@ -1373,7 +1373,7 @@
       <w:r>
         <w:drawing>
           <wp:inline xmlns:a="http://schemas.openxmlformats.org/drawingml/2006/main" xmlns:pic="http://schemas.openxmlformats.org/drawingml/2006/picture">
-            <wp:extent cx="5486400" cy="3429181"/>
+            <wp:extent cx="5486400" cy="4565588"/>
             <wp:docPr id="9" name="Picture 9"/>
             <wp:cNvGraphicFramePr>
               <a:graphicFrameLocks noChangeAspect="1"/>
@@ -1394,7 +1394,7 @@
                   <pic:spPr>
                     <a:xfrm>
                       <a:off x="0" y="0"/>
-                      <a:ext cx="5486400" cy="3429181"/>
+                      <a:ext cx="5486400" cy="4565588"/>
                     </a:xfrm>
                     <a:prstGeom prst="rect"/>
                   </pic:spPr>
@@ -1415,7 +1415,7 @@
           <w:i/>
           <w:sz w:val="20"/>
         </w:rPr>
-        <w:t>Figure 9. Thematic composition of the three clusters (Sankey). Left column = cluster; middle and right columns = the keywords that define each cluster (the right column mirrors the middle column to satisfy the tool's 3-stage layout). Ribbon width = keyword frequency across the full corpus.</w:t>
+        <w:t>Figure 9. Thematic composition and evolution of the three clusters (alluvial Sankey). Left column = cluster; middle column = keyword frequency in 2000-2017; right column = keyword frequency in 2018 onward. Ribbons show how each cluster's keywords persist or grow between the two periods; emergent keywords (e.g., COVID-19) appear only in the right column.</w:t>
       </w:r>
     </w:p>
     <w:p>

</xml_diff>

<commit_message>
Fig9: regenerate thematic evolution Sankey with Xiantao (14x9cm, 600 DPI)
- Replace all previous Fig9 versions (sankey_evolution, sankey_evolution2,
  sankey_evolution3, matplotlib variant) with a single publication-quality
  three-layer alluvial Sankey: Cluster -> Keyword -> Time-window.
- Source data: data/processed/thematic_evolution.json + keyword_clusters.json
- Rendered via Xiantao sankey_plot at 14x9cm, 600 DPI, horizontal labels,
  873 row samples scaled from 1252 keyword-window occurrences.
- Update manuscript.md Fig9 caption and regenerate paper_HPP_new.docx.
- Add build_sankey_xt.py for reproducibility.
</commit_message>
<xml_diff>
--- a/manuscript/paper_HPP_new.docx
+++ b/manuscript/paper_HPP_new.docx
@@ -1373,7 +1373,7 @@
       <w:r>
         <w:drawing>
           <wp:inline xmlns:a="http://schemas.openxmlformats.org/drawingml/2006/main" xmlns:pic="http://schemas.openxmlformats.org/drawingml/2006/picture">
-            <wp:extent cx="5486400" cy="4565588"/>
+            <wp:extent cx="5486400" cy="3525431"/>
             <wp:docPr id="9" name="Picture 9"/>
             <wp:cNvGraphicFramePr>
               <a:graphicFrameLocks noChangeAspect="1"/>
@@ -1394,7 +1394,7 @@
                   <pic:spPr>
                     <a:xfrm>
                       <a:off x="0" y="0"/>
-                      <a:ext cx="5486400" cy="4565588"/>
+                      <a:ext cx="5486400" cy="3525431"/>
                     </a:xfrm>
                     <a:prstGeom prst="rect"/>
                   </pic:spPr>
@@ -1415,7 +1415,7 @@
           <w:i/>
           <w:sz w:val="20"/>
         </w:rPr>
-        <w:t>Figure 9. Thematic composition and evolution of the three clusters (alluvial Sankey). Left column = cluster; middle column = keyword frequency in 2000-2017; right column = keyword frequency in 2018 onward. Ribbons show how each cluster's keywords persist or grow between the two periods; emergent keywords (e.g., COVID-19) appear only in the right column.</w:t>
+        <w:t>Figure 9. Three-layer alluvial Sankey of thematic evolution. Left column = the three thematic clusters; middle column = the 20 representative keywords; right column = the three time windows (2000–2009, 2010–2017, 2018 onward). Ribbon widths are proportional to keyword occurrence counts within each window; counts derive from keyword co-occurrence clustering and burst detection (Sections 3.6–3.7).</w:t>
       </w:r>
     </w:p>
     <w:p>

</xml_diff>

<commit_message>
Fig9 final: publication-quality two-window keyword alluvial
- Replace the Xiantao Cluster->Keyword->Time-window Sankey with the user's
  intended Cluster -> Keyword(2000-2017) -> Keyword(2018-2026) alluvial.
- Rendered with matplotlib at 13x10 inches / 600 DPI (7740x5940 px); horizontal
  external labels avoid overlap and match the original design.
- Net-new keywords (COVID-19, In Vitro Techniques) appear only in the right
  column, linked directly from their cluster.
- Data source: data/processed/thematic_evolution.json + keyword_clusters.json.
- Update manuscript.md Fig9 caption and regenerate paper_HPP_new.docx.
- Add build_sankey_final.py for reproducibility.
</commit_message>
<xml_diff>
--- a/manuscript/paper_HPP_new.docx
+++ b/manuscript/paper_HPP_new.docx
@@ -1373,7 +1373,7 @@
       <w:r>
         <w:drawing>
           <wp:inline xmlns:a="http://schemas.openxmlformats.org/drawingml/2006/main" xmlns:pic="http://schemas.openxmlformats.org/drawingml/2006/picture">
-            <wp:extent cx="5486400" cy="3525431"/>
+            <wp:extent cx="5486400" cy="4210493"/>
             <wp:docPr id="9" name="Picture 9"/>
             <wp:cNvGraphicFramePr>
               <a:graphicFrameLocks noChangeAspect="1"/>
@@ -1394,7 +1394,7 @@
                   <pic:spPr>
                     <a:xfrm>
                       <a:off x="0" y="0"/>
-                      <a:ext cx="5486400" cy="3525431"/>
+                      <a:ext cx="5486400" cy="4210493"/>
                     </a:xfrm>
                     <a:prstGeom prst="rect"/>
                   </pic:spPr>
@@ -1415,7 +1415,7 @@
           <w:i/>
           <w:sz w:val="20"/>
         </w:rPr>
-        <w:t>Figure 9. Three-layer alluvial Sankey of thematic evolution. Left column = the three thematic clusters; middle column = the 20 representative keywords; right column = the three time windows (2000–2009, 2010–2017, 2018 onward). Ribbon widths are proportional to keyword occurrence counts within each window; counts derive from keyword co-occurrence clustering and burst detection (Sections 3.6–3.7).</w:t>
+        <w:t>Figure 9. Thematic evolution alluvial diagram. Left column = the three thematic clusters; middle column = keyword frequency in 2000–2017; right column = keyword frequency in 2018–2026. Ribbons link each cluster to its keywords and trace how keyword prominence shifted between the two periods; net-new keywords (e.g., COVID-19, In Vitro Techniques) appear only in the right column. Keyword counts derive from co-occurrence clustering and burst detection (Sections 3.6–3.7).</w:t>
       </w:r>
     </w:p>
     <w:p>

</xml_diff>